<commit_message>
Revisione delle ripetizioni: abstract, introduzione e capitoli 2-8
Tolte frasi e didascalie che ripetevano concetti gia' detti, allineati i
rimandi (\ref al posto dei numeri scritti a mano, \ldb/\ldc), corrette
alcune incoerenze con i dati (PIR sul posto rilevato entro 1 m, gate
stazionari non impostabili, titoli dei capitoli nella struttura della
tesi, Digital Twin fuori dalla Sezione 1.1). Bozze Word dei capitoli 4 e 5
allineate.

Co-Authored-By: Claude Opus 5.5 <noreply@anthropic.com>
</commit_message>
<xml_diff>
--- a/bozza_capitolo4.docx
+++ b/bozza_capitolo4.docx
@@ -163,7 +163,7 @@
         <w:rPr>
           <w:lang w:val="it-IT"/>
         </w:rPr>
-        <w:t>Questa divisione ha anche una conseguenza pratica. Durante la prova l'operatore non ha bisogno di leggere i numeri. Gli basta sapere che i dati stanno arrivando e che i sensori vedono ciò che devono vedere. Questo è il compito dell'interfaccia web presentata nella Sezione 4.5, che mostra i sensori in tempo reale e permette di controllare il posizionamento prima di avviare la registrazione. Nel confronto il suo ruolo è quindi di supporto e di verifica, come precisato nella Sezione 4.5.4.</w:t>
+        <w:t>Durante la prova, quindi, l'operatore non ha bisogno di leggere i numeri, e l'interfaccia web serve a controllare in tempo reale che i sensori vedano ciò che devono vedere (Sezione 4.5.4).</w:t>
       </w:r>
     </w:p>
     <w:p>
@@ -199,21 +199,20 @@
         <w:rPr>
           <w:lang w:val="it-IT"/>
         </w:rPr>
-        <w:t xml:space="preserve">Il protocollo è stato definito prima delle acquisizioni ed è rimasto invariato per tutta la campagna. Il PIR lavora nella configurazione a lui più favorevole, con il ponticello di </w:t>
+        <w:t>Il protocollo è stato definito prima delle acquisizioni. Il PIR lavora nella configurazione a lui più favorevole, con il ponticello di ritrigger in posizione H, in tutte le serie in cui il ponticello conta (Sezione 5.2.1), mentre</w:t>
       </w:r>
       <w:proofErr w:type="spellStart"/>
       <w:r>
         <w:rPr>
           <w:lang w:val="it-IT"/>
         </w:rPr>
-        <w:t>ritrigger</w:t>
       </w:r>
       <w:proofErr w:type="spellEnd"/>
       <w:r>
         <w:rPr>
           <w:lang w:val="it-IT"/>
         </w:rPr>
-        <w:t xml:space="preserve"> in posizione H (Sezioni 2.1.3 e 3.3.3), mentre l'HLK-LD2410B mantiene sempre le soglie di fabbrica (Sezione 3.6). L'HLK-LD2420 è stato provato in un secondo tempo nelle stesse geometrie, con le deroghe dichiarate nella Sezione 4.4. Ogni scenario è ripetuto più volte, e i valori riportati nella forma μ ± σ sono la media e la deviazione standard su quelle ripetizioni.</w:t>
+        <w:t xml:space="preserve"> l'HLK-LD2410B mantiene sempre le soglie di fabbrica (Sezione 3.6). L'HLK-LD2420 è stato provato in un secondo tempo nelle stesse geometrie, con le deroghe dichiarate nella Sezione 4.4. Ogni scenario è ripetuto più volte, e i valori riportati nella forma μ ± σ sono la media e la deviazione standard su quelle ripetizioni.</w:t>
       </w:r>
     </w:p>
     <w:p>
@@ -249,7 +248,7 @@
         <w:rPr>
           <w:lang w:val="it-IT"/>
         </w:rPr>
-        <w:t>puntano verso un'area di prova che ricade nel campo di entrambi. Nella stanza non ci sono oggetti in movimento (nessun ventilatore, tende ferme, porta chiusa). Le quattro geometrie di prova sono schematizzate in Figura 4.2. Lo stesso supporto ha ospitato l'HLK-LD2420 nella campagna ridotta (Sezione 4.4).</w:t>
+        <w:t>puntano verso un'area di prova che ricade nel campo di entrambi. Nella stanza non ci sono oggetti in movimento (nessun ventilatore, tende ferme, porta chiusa). Le quattro geometrie di prova sono schematizzate in Figura 4.2.</w:t>
       </w:r>
     </w:p>
     <w:p>
@@ -399,7 +398,7 @@
         <w:rPr>
           <w:lang w:val="it-IT"/>
         </w:rPr>
-        <w:t>La Tabella 4.1 raggruppa gli scenari per domanda e riporta per ciascuno il numero di ripetizioni, lo scarto iniziale della Sezione 4.3.3 e la sezione del Capitolo 5 con i risultati. Di norma uno scenario è ripetuto cinque volte, dieci per la latenza d'ingresso e tre quando serve una seconda persona o le condizioni da coprire sono molte. Ogni scenario ha un nome, che è anche il nome dei suoi file. Il respiro a ritmo imposto usa gli stessi file e le stesse geometrie ed è trattato nel Capitolo 6.</w:t>
+        <w:t>La Tabella 4.1 raggruppa gli scenari per domanda. Di norma uno scenario è ripetuto cinque volte, dieci per la latenza d'ingresso e tre quando serve una seconda persona o le condizioni da coprire sono molte. Ogni scenario ha un nome, che è anche il nome dei suoi file. Il respiro a ritmo imposto usa lo stesso setup e lo stesso formato dei file ed è trattato nel Capitolo 6.</w:t>
       </w:r>
     </w:p>
     <w:p>
@@ -2255,7 +2254,7 @@
         <w:rPr>
           <w:lang w:val="it-IT"/>
         </w:rPr>
-        <w:t xml:space="preserve"> il PIR non è cablato nei test del solo HLK-LD2420, e i suoi valori sono marcati come assenti (Sezione 3.4.3). Poiché l'esemplare in dotazione è con ogni probabilità difettoso (Sezione 3.2.6), i risultati ottenuti descrivono quel singolo modulo e non vanno generalizzati al modello HLK-LD2420.</w:t>
+        <w:t xml:space="preserve"> il PIR non è cablato nei test del solo HLK-LD2420, e i suoi valori sono marcati come assenti (Sezione 3.4.3). Poiché l'esemplare in dotazione è con ogni probabilità difettoso, i risultati ottenuti descrivono quel singolo modulo e non vanno generalizzati al modello HLK-LD2420.</w:t>
       </w:r>
     </w:p>
     <w:p>
@@ -2305,7 +2304,7 @@
         <w:rPr>
           <w:lang w:val="it-IT"/>
         </w:rPr>
-        <w:t>L'ESP32 pubblica i dati e una pagina web li mostra in tempo reale, li salva insieme alle statistiche di sessione e li esporta in CSV. Il risultato è una dashboard servita direttamente dal nodo, senza alcuna rete esterna, che produce lo stesso formato dati della catena seriale. Questa sezione ne riassume requisiti, progetto, realizzazione e verifica, e chiarisce il ruolo che ha avuto nella campagna.</w:t>
+        <w:t>L'ESP32 pubblica i dati e una pagina web li mostra in tempo reale, li salva insieme alle statistiche di sessione e li esporta in CSV. Questa sezione ne riassume requisiti, progetto, realizzazione e verifica, e chiarisce il ruolo che ha avuto nella campagna.</w:t>
       </w:r>
     </w:p>
     <w:p>
@@ -3108,7 +3107,7 @@
         <w:rPr>
           <w:lang w:val="it-IT"/>
         </w:rPr>
-        <w:t>per l'HLK-LD2410B [ld2410configurator], da cui è ripresa la rappresentazione a barre delle energie per gate con la soglia sovrapposta. La pagina è divisa in quattro aree (Figure 4.4 e 4.5). La prima mostra lo stato istantaneo dei due sensori. La seconda contiene la gauge dell'indice di vitalità, con i colori del semaforo in ordine inverso all'indice, cioè rosso per la classe bassa, che per il soccorso è la più urgente (Sezione 6.4). La terza raccoglie i tre grafici degli ultimi 60 s, con l'energia, le barre per gate con le soglie lette dal modulo all'avvio e la timeline della presenza di radar e PIR sulla stessa base dei tempi. La quarta gestisce la sessione di registrazione, con gli stessi metadati sperimentali della catena seriale. Le soglie, deliberatamente, non si possono modificare dalla pagina, perché devono restare fisse per tutta la campagna (Sezione 4.2).</w:t>
+        <w:t>per l'HLK-LD2410B [ld2410configurator], da cui è ripresa la rappresentazione a barre delle energie per gate con la soglia sovrapposta. La pagina è divisa in quattro aree (Figure 4.4 e 4.5). La prima mostra lo stato istantaneo dei due sensori. La seconda contiene la gauge dell'indice di vitalità, con i colori del semaforo (Sezione 6.4). La terza raccoglie i tre grafici degli ultimi 60 s, con l'energia, le barre per gate con le soglie lette dal modulo all'avvio e la timeline della presenza di radar e PIR sulla stessa base dei tempi. La quarta gestisce la sessione di registrazione, con gli stessi metadati sperimentali della catena seriale. Le soglie, deliberatamente, non si possono modificare dalla pagina, perché devono restare fisse per tutta la campagna (Sezione 4.2).</w:t>
       </w:r>
     </w:p>
     <w:p>
@@ -4508,7 +4507,7 @@
           <w:sz w:val="20"/>
           <w:lang w:val="it-IT"/>
         </w:rPr>
-        <w:t>Figura 4.6: I due percorsi dei dati del firmware della web UI. Sopra il percorso seriale, in cui lo script di acquisizione aggiunge i metadati sperimentali. Sotto la web UI, servita dal nodo in modalità Access Point senza alcuna rete esterna, che esporta dal browser lo stesso CSV con in coda le due colonne dell'indice calcolato a bordo. I due file coincidono campione per campione e sono letti dallo stesso script di analisi.</w:t>
+        <w:t>Figura 4.6: I due percorsi dei dati del firmware della web UI. Sopra il percorso seriale, in cui lo script di acquisizione aggiunge i metadati sperimentali. Sotto la web UI, servita dal nodo in modalità Access Point, che esporta dal browser lo stesso CSV. I due file coincidono campione per campione e sono letti dallo stesso script di analisi.</w:t>
       </w:r>
     </w:p>
     <w:p>
@@ -4544,7 +4543,7 @@
         <w:rPr>
           <w:lang w:val="it-IT"/>
         </w:rPr>
-        <w:t>Nella campagna l'interfaccia ha svolto tre funzioni.</w:t>
+        <w:t>Nella campagna l'interfaccia ha svolto due funzioni.</w:t>
       </w:r>
     </w:p>
     <w:p>
@@ -4591,27 +4590,6 @@
     </w:p>
     <w:p>
       <w:pPr>
-        <w:pStyle w:val="Puntoelenco"/>
-        <w:rPr>
-          <w:lang w:val="it-IT"/>
-        </w:rPr>
-      </w:pPr>
-      <w:r>
-        <w:rPr>
-          <w:b/>
-          <w:lang w:val="it-IT"/>
-        </w:rPr>
-        <w:t xml:space="preserve">Indice di vitalità a bordo: </w:t>
-      </w:r>
-      <w:r>
-        <w:rPr>
-          <w:lang w:val="it-IT"/>
-        </w:rPr>
-        <w:t>l'interfaccia ospita il calcolo dell'indice sul nodo, confrontato con il riferimento offline nella Sezione 6.6.</w:t>
-      </w:r>
-    </w:p>
-    <w:p>
-      <w:pPr>
         <w:jc w:val="both"/>
         <w:rPr>
           <w:lang w:val="it-IT"/>
@@ -4621,7 +4599,7 @@
         <w:rPr>
           <w:lang w:val="it-IT"/>
         </w:rPr>
-        <w:t>Il calcolo delle metriche di confronto resta invece affidato alla catena di analisi sui file, secondo la divisione descritta nella Sezione 4.1, perché solo così ogni numero del Capitolo 5 si può ricalcolare a partire dagli stessi dati.</w:t>
+        <w:t>Il calcolo delle metriche di confronto resta invece affidato alla catena di analisi sui file (Sezione 4.1).</w:t>
       </w:r>
     </w:p>
     <w:sectPr>

</xml_diff>

<commit_message>
Capitolo 5: revisione delle sezioni 5.4-5.11, dati del LD2420 nelle figure, correzioni grafiche
- 5.4-5.10 riscritte per chiarezza (localizzazione sotto il banco, energia, latenze,
  selettivita', due persone, ostacoli, portata in corridoio); porta del Test 3.6 a
  ~3,8 m dal sensore (corretti tesi, figura 14, registro e CLAUDE.md)
- Tabella 5.6: colonna copertura, PIR come riduzione del rilevamento
- Eliminate le sezioni 5.11 (secondo radar) e 5.12 (sintesi): rimandi ripuntati,
  riscontro Dell'Aquila spostato nel 3.2.6, frase sui limiti nelle conclusioni
- Figure: barra del LD2420 in latenze e dose-risposta, legende e titoli che non
  toccano gli assi, accenti, virgola decimale; figure 14, 15, 17, 21 aggiornate
- Bozze Word dei capitoli 4 e 5 allineate

Co-Authored-By: Claude Opus 5.5 <noreply@anthropic.com>
</commit_message>
<xml_diff>
--- a/bozza_capitolo4.docx
+++ b/bozza_capitolo4.docx
@@ -1392,7 +1392,7 @@
               <w:rPr>
                 <w:lang w:val="it-IT"/>
               </w:rPr>
-              <w:t>Selettività con gate massimo 2</w:t>
+              <w:t>Selettività con gate massimo 2*</w:t>
             </w:r>
           </w:p>
         </w:tc>
@@ -1995,7 +1995,7 @@
         <w:rPr>
           <w:lang w:val="it-IT"/>
         </w:rPr>
-        <w:t>scostamento fra la distanza riportata dal radar e quella reale, tenendo separata la dispersione fra un trial e l'altro da quella entro il singolo trial.</w:t>
+        <w:t>scostamento fra la distanza riportata dal radar e quella reale, tenendo separata la dispersione fra un trial e l'altro da quella entro il singolo trial. La linearità della risposta si valuta con una regressione lineare fra distanza riportata e reale. Il coefficiente di determinazione R² indica quanta parte della variazione della distanza riportata è spiegata dalla retta, e vale 1 quando i punti vi stanno esattamente sopra.</w:t>
       </w:r>
     </w:p>
     <w:p>
@@ -2242,7 +2242,7 @@
         <w:rPr>
           <w:lang w:val="it-IT"/>
         </w:rPr>
-        <w:t xml:space="preserve">noltre, il gate 0 è portato sopra la coda del rumore, nella configurazione v2 (Sezione 5.11). </w:t>
+        <w:t xml:space="preserve">noltre, il gate 0 è portato sopra la coda del rumore, nella configurazione v2 (Sezione 5.1). </w:t>
       </w:r>
       <w:r>
         <w:rPr>

</xml_diff>

<commit_message>
Impaginazione: file dei capitoli rinominati, float e tabelle sistemati
- file dei capitoli rinominati con numero e titolo, aggiunti i ringraziamenti
- tolti i vspace rimasti dalla vecchia classe sotto le figure 5.11, 5.14 e 6.1
- elenchi compatti e pagine di soli float allineate in alto
- figura 1.1 al 90 %: il capitolo 1 non lascia piu' una pagina con cinque righe
- equazione (1), tabelle 2.1, 4.1, 5.3 e 5.6 e percorsi della bibliografia
  dentro il margine
- minuscola dopo i due punti nei capitoli 3 e 4, bozze Word allineate

Co-Authored-By: Claude Opus 5.5 <noreply@anthropic.com>
</commit_message>
<xml_diff>
--- a/bozza_capitolo4.docx
+++ b/bozza_capitolo4.docx
@@ -84,7 +84,7 @@
           <w:bCs/>
           <w:lang w:val="it-IT"/>
         </w:rPr>
-        <w:t>S</w:t>
+        <w:t>Sperimentale: consiste</w:t>
       </w:r>
       <w:r>
         <w:rPr>
@@ -92,7 +92,6 @@
           <w:bCs/>
           <w:lang w:val="it-IT"/>
         </w:rPr>
-        <w:t>perimentale</w:t>
       </w:r>
       <w:r>
         <w:rPr>
@@ -100,13 +99,12 @@
           <w:bCs/>
           <w:lang w:val="it-IT"/>
         </w:rPr>
-        <w:t>:</w:t>
-      </w:r>
-      <w:r>
-        <w:rPr>
-          <w:lang w:val="it-IT"/>
-        </w:rPr>
-        <w:t xml:space="preserve"> Consiste nel disporre i sensori e il soggetto in geometrie definite e nel cambiare, da una prova all'altra, una sola variabile per volta, che può essere la distanza, la quantità o il tipo di movimento, l'angolo oppure il materiale interposto. Ogni configurazione viene ripetuta e ogni ripetizione produce un file. </w:t>
+      </w:r>
+      <w:r>
+        <w:rPr>
+          <w:lang w:val="it-IT"/>
+        </w:rPr>
+        <w:t xml:space="preserve"> nel disporre i sensori e il soggetto in geometrie definite e nel cambiare, da una prova all'altra, una sola variabile per volta, che può essere la distanza, la quantità o il tipo di movimento, l'angolo oppure il materiale interposto. Ogni configurazione viene ripetuta e ogni ripetizione produce un file. </w:t>
       </w:r>
     </w:p>
     <w:p>
@@ -127,7 +125,7 @@
           <w:bCs/>
           <w:lang w:val="it-IT"/>
         </w:rPr>
-        <w:t>N</w:t>
+        <w:t>Numerica: i file</w:t>
       </w:r>
       <w:r>
         <w:rPr>
@@ -135,7 +133,6 @@
           <w:bCs/>
           <w:lang w:val="it-IT"/>
         </w:rPr>
-        <w:t>umerica</w:t>
       </w:r>
       <w:r>
         <w:rPr>
@@ -143,13 +140,12 @@
           <w:bCs/>
           <w:lang w:val="it-IT"/>
         </w:rPr>
-        <w:t>:</w:t>
-      </w:r>
-      <w:r>
-        <w:rPr>
-          <w:lang w:val="it-IT"/>
-        </w:rPr>
-        <w:t xml:space="preserve"> I file formano un dataset omogeneo, raccolto nel formato unico della Sezione 3.4.3 e analizzato a posteriori dalla catena descritta nella Sezione 3.4.5. Le metriche, quindi, non vengono lette durante la prova. Sono calcolate in seguito, dagli stessi script e con le stesse convenzioni per tutti i sensori. In questo modo un risultato si può ricalcolare e una figura si può rifare senza ripetere l'acquisizione, e ogni numero del Capitolo 5 risale a un file e a una riga di comando precisi.</w:t>
+      </w:r>
+      <w:r>
+        <w:rPr>
+          <w:lang w:val="it-IT"/>
+        </w:rPr>
+        <w:t xml:space="preserve"> formano un dataset omogeneo, raccolto nel formato unico della Sezione 3.4.3 e analizzato a posteriori dalla catena descritta nella Sezione 3.4.5. Le metriche, quindi, non vengono lette durante la prova. Sono calcolate in seguito, dagli stessi script e con le stesse convenzioni per tutti i sensori. In questo modo un risultato si può ricalcolare e una figura si può rifare senza ripetere l'acquisizione, e ogni numero del Capitolo 5 risale a un file e a una riga di comando precisi.</w:t>
       </w:r>
     </w:p>
     <w:p>

</xml_diff>